<commit_message>
feat(testakten): Auerbach Cue-Sheet um GEMA-Anbindung erweitern
Cue-Sheet-Aktenstueck 12 verweist jetzt auf die neue GEMA-Werkanmeldung
(Aktenstueck 18) und auf das vorlaeufige Sachverstaendigengutachten
(Aktenstueck 16), inklusive Statustabelle der offenen Pruefschritte.
Gesamt-PDF neu gerendert.
</commit_message>
<xml_diff>
--- a/testakten/urheberrecht-musik-ki-songstreit-auerbach/12-cue-sheet-und-gema-vorbereitung.docx
+++ b/testakten/urheberrecht-musik-ki-songstreit-auerbach/12-cue-sheet-und-gema-vorbereitung.docx
@@ -431,6 +431,204 @@
         <w:t>Ein falsches Cue-Sheet kann später mehr Schaden machen als ein verspätetes Cue-Sheet. Erst Rechtekette plausibilisieren, dann melden. Wenn Fristdruck besteht, mit Vorbehalt und Änderungslog arbeiten.</w:t>
       </w:r>
     </w:p>
+    <w:p>
+      <w:pPr>
+        <w:pStyle w:val="Heading2"/>
+      </w:pPr>
+      <w:r>
+        <w:t>Anbindung an die GEMA-Werkanmeldung (Stand 02.06.2026)</w:t>
+      </w:r>
+    </w:p>
+    <w:p>
+      <w:r>
+        <w:t>Die formale Werkanmeldung wurde als eigenes Aktenstueck ausgearbeitet, siehe 18-gema-werkanmeldung-entwurf-mit-vorbehalt.docx. Sie uebernimmt den Split-Vorschlag aus diesem Cue-Sheet unveraendert, ergaenzt jedoch Vorbehaltsvermerke zu jeder streitigen Position sowie ein Aenderungslog fuer spaetere Korrekturen.</w:t>
+      </w:r>
+    </w:p>
+    <w:p>
+      <w:pPr>
+        <w:pStyle w:val="Heading3"/>
+      </w:pPr>
+      <w:r>
+        <w:t>Auswirkung des vorlaeufigen Sachverstaendigengutachtens auf die Meldung</w:t>
+      </w:r>
+    </w:p>
+    <w:p>
+      <w:r>
+        <w:t>Das vorlaeufige Sachverstaendigengutachten (Aktenstueck 16) bestaetigt eine deutliche melodische Naehe der Hookline zur Valtin-Demo, kann die Nachtbogen-Frage aber mangels ausreichendem Referenzmaterial noch nicht klaeren. Die Anteile in der GEMA-Meldung wurden deshalb vorerst nicht veraendert; lediglich die Vorbehaltsvermerke wurden nach Vorliegen des Gutachtens praezisiert.</w:t>
+      </w:r>
+    </w:p>
+    <w:tbl>
+      <w:tblPr>
+        <w:tblStyle w:val="LightGrid-Accent1"/>
+        <w:tblW w:type="auto" w:w="0"/>
+        <w:tblLook w:firstColumn="1" w:firstRow="1" w:lastColumn="0" w:lastRow="0" w:noHBand="0" w:noVBand="1" w:val="04A0"/>
+      </w:tblPr>
+      <w:tblGrid>
+        <w:gridCol w:w="3024"/>
+        <w:gridCol w:w="3024"/>
+        <w:gridCol w:w="3024"/>
+      </w:tblGrid>
+      <w:tr>
+        <w:tc>
+          <w:tcPr>
+            <w:tcW w:type="dxa" w:w="3024"/>
+          </w:tcPr>
+          <w:p>
+            <w:r>
+              <w:t>Pruefschritt</w:t>
+            </w:r>
+          </w:p>
+        </w:tc>
+        <w:tc>
+          <w:tcPr>
+            <w:tcW w:type="dxa" w:w="3024"/>
+          </w:tcPr>
+          <w:p>
+            <w:r>
+              <w:t>Status</w:t>
+            </w:r>
+          </w:p>
+        </w:tc>
+        <w:tc>
+          <w:tcPr>
+            <w:tcW w:type="dxa" w:w="3024"/>
+          </w:tcPr>
+          <w:p>
+            <w:r>
+              <w:t>Naechster Termin</w:t>
+            </w:r>
+          </w:p>
+        </w:tc>
+      </w:tr>
+      <w:tr>
+        <w:tc>
+          <w:tcPr>
+            <w:tcW w:type="dxa" w:w="3024"/>
+          </w:tcPr>
+          <w:p>
+            <w:r>
+              <w:t>Cue-Sheet Splitvorschlag</w:t>
+            </w:r>
+          </w:p>
+        </w:tc>
+        <w:tc>
+          <w:tcPr>
+            <w:tcW w:type="dxa" w:w="3024"/>
+          </w:tcPr>
+          <w:p>
+            <w:r>
+              <w:t>vorlaeufig abgestimmt</w:t>
+            </w:r>
+          </w:p>
+        </w:tc>
+        <w:tc>
+          <w:tcPr>
+            <w:tcW w:type="dxa" w:w="3024"/>
+          </w:tcPr>
+          <w:p>
+            <w:r>
+              <w:t>-</w:t>
+            </w:r>
+          </w:p>
+        </w:tc>
+      </w:tr>
+      <w:tr>
+        <w:tc>
+          <w:tcPr>
+            <w:tcW w:type="dxa" w:w="3024"/>
+          </w:tcPr>
+          <w:p>
+            <w:r>
+              <w:t>GEMA-Werkanmeldung mit Vorbehalt</w:t>
+            </w:r>
+          </w:p>
+        </w:tc>
+        <w:tc>
+          <w:tcPr>
+            <w:tcW w:type="dxa" w:w="3024"/>
+          </w:tcPr>
+          <w:p>
+            <w:r>
+              <w:t>eingereicht</w:t>
+            </w:r>
+          </w:p>
+        </w:tc>
+        <w:tc>
+          <w:tcPr>
+            <w:tcW w:type="dxa" w:w="3024"/>
+          </w:tcPr>
+          <w:p>
+            <w:r>
+              <w:t>Korrekturmeldung nach Endgutachten</w:t>
+            </w:r>
+          </w:p>
+        </w:tc>
+      </w:tr>
+      <w:tr>
+        <w:tc>
+          <w:tcPr>
+            <w:tcW w:type="dxa" w:w="3024"/>
+          </w:tcPr>
+          <w:p>
+            <w:r>
+              <w:t>Sachverstaendigen-Endgutachten</w:t>
+            </w:r>
+          </w:p>
+        </w:tc>
+        <w:tc>
+          <w:tcPr>
+            <w:tcW w:type="dxa" w:w="3024"/>
+          </w:tcPr>
+          <w:p>
+            <w:r>
+              <w:t>ausstehend</w:t>
+            </w:r>
+          </w:p>
+        </w:tc>
+        <w:tc>
+          <w:tcPr>
+            <w:tcW w:type="dxa" w:w="3024"/>
+          </w:tcPr>
+          <w:p>
+            <w:r>
+              <w:t>nach Eingang Nachtbogen-Masterdatei</w:t>
+            </w:r>
+          </w:p>
+        </w:tc>
+      </w:tr>
+      <w:tr>
+        <w:tc>
+          <w:tcPr>
+            <w:tcW w:type="dxa" w:w="3024"/>
+          </w:tcPr>
+          <w:p>
+            <w:r>
+              <w:t>Verlagsvertrag Silberfarn</w:t>
+            </w:r>
+          </w:p>
+        </w:tc>
+        <w:tc>
+          <w:tcPr>
+            <w:tcW w:type="dxa" w:w="3024"/>
+          </w:tcPr>
+          <w:p>
+            <w:r>
+              <w:t>in Verhandlung</w:t>
+            </w:r>
+          </w:p>
+        </w:tc>
+        <w:tc>
+          <w:tcPr>
+            <w:tcW w:type="dxa" w:w="3024"/>
+          </w:tcPr>
+          <w:p>
+            <w:r>
+              <w:t>Zielabschluss vor Kampagnenstart 01.07.2026</w:t>
+            </w:r>
+          </w:p>
+        </w:tc>
+      </w:tr>
+    </w:tbl>
     <w:sectPr>
       <w:pgSz w:w="11906" w:h="16838"/>
       <w:pgMar w:top="1417" w:right="1417" w:bottom="1417" w:left="1417" w:header="720" w:footer="720" w:gutter="0"/>

</xml_diff>